<commit_message>
Fix: Nifty 1H symbol, bearish scan pass, P&L multiplier, date filter, diagnostics
</commit_message>
<xml_diff>
--- a/NSE_Swing_Trade_Strategy.docx
+++ b/NSE_Swing_Trade_Strategy.docx
@@ -35,7 +35,7 @@
           <w:color w:val="888888"/>
           <w:sz w:val="32"/>
         </w:rPr>
-        <w:t>Complete Trading Strategy Document</w:t>
+        <w:t>Complete Trading Strategy Document v1.2</w:t>
       </w:r>
     </w:p>
     <w:p>
@@ -43,17 +43,15 @@
         <w:jc w:val="center"/>
       </w:pPr>
       <w:r>
-        <w:rPr>
-          <w:color w:val="888888"/>
-          <w:sz w:val="24"/>
-        </w:rPr>
         <w:br/>
-        <w:t>Version 1.1 — June 16, 2026</w:t>
+        <w:t>June 21, 2026</w:t>
         <w:br/>
         <w:br/>
         <w:t>Nifty500 Universe | Heiken-Ashi Breakout | 1H TV-Style Entry</w:t>
         <w:br/>
         <w:t>₹1.5L/Trade | 5% SL | 10% Target</w:t>
+        <w:br/>
+        <w:t>SQLite Database | Intraday Scans | Auto-Refresh | Nifty50 FUT</w:t>
       </w:r>
     </w:p>
     <w:p>
@@ -84,7 +82,7 @@
         <w:spacing w:after="40"/>
       </w:pPr>
       <w:r>
-        <w:t>2. Scan Universe — Nifty500</w:t>
+        <w:t>2. Scan Universe — Nifty500 + Nifty50 Index</w:t>
       </w:r>
     </w:p>
     <w:p>
@@ -165,6 +163,33 @@
         <w:spacing w:after="40"/>
       </w:pPr>
       <w:r>
+        <w:t>11. Data Persistence — SQLite Database</w:t>
+      </w:r>
+    </w:p>
+    <w:p>
+      <w:pPr>
+        <w:pStyle w:val="ListNumber"/>
+        <w:spacing w:after="40"/>
+      </w:pPr>
+      <w:r>
+        <w:t>12. Nifty 50 Index Trading</w:t>
+      </w:r>
+    </w:p>
+    <w:p>
+      <w:pPr>
+        <w:pStyle w:val="ListNumber"/>
+        <w:spacing w:after="40"/>
+      </w:pPr>
+      <w:r>
+        <w:t>13. Auto-Refresh &amp; Dashboard Sync</w:t>
+      </w:r>
+    </w:p>
+    <w:p>
+      <w:pPr>
+        <w:pStyle w:val="ListNumber"/>
+        <w:spacing w:after="40"/>
+      </w:pPr>
+      <w:r>
         <w:t>Appendix: Key Code Parameters</w:t>
       </w:r>
     </w:p>
@@ -194,7 +219,7 @@
         <w:t xml:space="preserve">Pass 1 — Daily Screening: </w:t>
       </w:r>
       <w:r>
-        <w:t>Downloads 6 months of daily OHLC data. Applies Heiken-Ashi smoothing, EMA20/SMA50 crossover logic, volume filters, market cap filter, and RSI filter. Only stocks passing all criteria proceed to Pass 2.</w:t>
+        <w:t>Downloads 6 months of daily OHLC data via yfinance. Applies Heiken-Ashi smoothing, EMA20/SMA50 crossover logic, volume filters, market cap filter (₹5,000 Cr min), and RSI filter (40-70). Only stocks passing all criteria proceed to Pass 2.</w:t>
       </w:r>
     </w:p>
     <w:p>
@@ -205,7 +230,7 @@
         <w:t xml:space="preserve">Pass 2 — 1H Entry Analysis: </w:t>
       </w:r>
       <w:r>
-        <w:t>Downloads 10 days of 1-hour data for qualifying stocks. Computes ADX/DMI for trend strength, pivot/ATR structural levels, and generates entry signals: BUY-R, BUY-B, SELL-R, SELL-B, or NEUTRAL.</w:t>
+        <w:t>Downloads 10 days of 1-hour data for qualifying stocks via yfinance. Computes ADX/DMI for trend strength, pivot/ATR structural levels, and generates entry signals: BUY-R, BUY-B, SELL-R, SELL-B, or NEUTRAL.</w:t>
       </w:r>
     </w:p>
     <w:p>
@@ -213,16 +238,27 @@
         <w:rPr>
           <w:b/>
         </w:rPr>
-        <w:t xml:space="preserve">Position Creation: </w:t>
+        <w:t xml:space="preserve">Position Creation (Stocks): </w:t>
       </w:r>
       <w:r>
-        <w:t>BUY-R and BUY-B signals automatically create trade positions with ₹1.5L capital, 5% stop-loss, and 10% profit target. Same-day entry during market hours via intraday scans; next-day open entry for end-of-day scans.</w:t>
+        <w:t>BUY-R and BUY-B signals automatically create trade positions with ₹1.5L capital, 5% stop-loss, and 10% profit target. Quantity = Capital ÷ Entry Price. Same-day entry during market hours via intraday scans; next-day open entry for end-of-day scans.</w:t>
+      </w:r>
+    </w:p>
+    <w:p>
+      <w:r>
+        <w:rPr>
+          <w:b/>
+        </w:rPr>
+        <w:t xml:space="preserve">Position Creation (Nifty 50 Index): </w:t>
+      </w:r>
+      <w:r>
+        <w:t>Nifty 50 is scanned as a special instrument with 100-point stop-loss, 300-point profit target, and 1 Qty (65 lot multiplier). P&amp;L = (Close - Entry) × 1 × 65.</w:t>
       </w:r>
     </w:p>
     <w:p>
       <w:r>
         <w:br/>
-        <w:t>All positions are monitored every 15 minutes for stop-loss and target hits. A web dashboard and performance report provide real-time visibility into scan results, active positions, and portfolio P&amp;L.</w:t>
+        <w:t>All positions are monitored every 15 minutes for stop-loss and target hits via APScheduler. Data is stored in a SQLite database (trades_history.db) with persistent disk storage on Render, ensuring no data loss across restarts. The dashboard auto-refreshes every 5 minutes to sync with scheduled scans.</w:t>
       </w:r>
     </w:p>
     <w:p>
@@ -230,12 +266,12 @@
         <w:pStyle w:val="Heading1"/>
       </w:pPr>
       <w:r>
-        <w:t>2. Scan Universe — Nifty500</w:t>
+        <w:t>2. Scan Universe — Nifty500 + Nifty50 Index</w:t>
       </w:r>
     </w:p>
     <w:p>
       <w:r>
-        <w:t>The scanner covers the Nifty500 universe — the top 500 companies listed on the National Stock Exchange of India by market capitalization. This covers approximately 90% of the total market capitalization of NSE.</w:t>
+        <w:t>The scanner covers the Nifty500 universe — the top 500 companies listed on the National Stock Exchange of India by market capitalization. Additionally, the Nifty 50 Spot Index (^NSEI) is always included for index futures trading signals.</w:t>
       </w:r>
     </w:p>
     <w:p>
@@ -243,7 +279,7 @@
         <w:pStyle w:val="Heading2"/>
       </w:pPr>
       <w:r>
-        <w:t>Symbol Sources</w:t>
+        <w:t>Stock Sources</w:t>
       </w:r>
     </w:p>
     <w:p>
@@ -289,8 +325,16 @@
       </w:r>
     </w:p>
     <w:p>
+      <w:pPr>
+        <w:pStyle w:val="ListBullet"/>
+      </w:pPr>
       <w:r>
-        <w:t>The total scanned count is displayed on the dashboard as "📡 Scanned" so you always know how many stocks were analyzed vs how many passed filters.</w:t>
+        <w:t>Nifty 50 Index — always included for FUT signals</w:t>
+      </w:r>
+    </w:p>
+    <w:p>
+      <w:r>
+        <w:t>The total scanned count is displayed on the dashboard as "📡 Scanned". The Nifty 50 Index is included in the scan but not counted in the stock universe total.</w:t>
       </w:r>
     </w:p>
     <w:p>
@@ -346,7 +390,7 @@
         <w:t>• C3: EMA20 &gt; SMA50 (Golden Crossover — short-term above long-term)</w:t>
         <w:br/>
         <w:br/>
-        <w:t>If all three are true and persist for 1+ days, the stock is classified as a "Fresh Breakout" (1-3 days), "Strong Momentum" (4-10 days), or "Already Rallied" (10+ days).</w:t>
+        <w:t>If all three are true and persist for 1+ days: "Fresh Breakout" (1-3 days), "Strong Momentum" (4-10 days), or "Already Rallied" (10+ days).</w:t>
       </w:r>
     </w:p>
     <w:p>
@@ -354,16 +398,16 @@
         <w:pStyle w:val="Heading2"/>
       </w:pPr>
       <w:r>
-        <w:t>3.3 Volume Filter</w:t>
+        <w:t>3.3 Volume &amp; Market Cap Filters</w:t>
       </w:r>
     </w:p>
     <w:p>
       <w:r>
         <w:t>• Minimum average volume: 500,000 shares over 20-day lookback</w:t>
         <w:br/>
+        <w:t>• Minimum market cap: ₹5,000 Crores (estimated from Price × Avg Vol × 20 / 10M)</w:t>
+        <w:br/>
         <w:t>• Volume spike detection: compares latest volume to 20-day average</w:t>
-        <w:br/>
-        <w:t>• Volume spike confirmation added as a positive factor</w:t>
       </w:r>
     </w:p>
     <w:p>
@@ -371,67 +415,18 @@
         <w:pStyle w:val="Heading2"/>
       </w:pPr>
       <w:r>
-        <w:t>3.4 Market Cap Filter</w:t>
+        <w:t>3.4 RSI &amp; Relative Strength</w:t>
       </w:r>
     </w:p>
     <w:p>
       <w:r>
-        <w:t>• Minimum market cap: ₹5,000 Crores</w:t>
+        <w:t>• RSI period: 14, Range: 40-70 (disabled for manual scans via dashboard)</w:t>
         <w:br/>
-        <w:t>• Estimated from: (Price × Average Volume × 20) / 10,000,000</w:t>
+        <w:t>• Relative Strength: compares stock performance to Nifty 50 over 63 days, scored 0-100</w:t>
         <w:br/>
-        <w:t>• Ensures only liquid, institutional-grade stocks are traded</w:t>
-      </w:r>
-    </w:p>
-    <w:p>
-      <w:pPr>
-        <w:pStyle w:val="Heading2"/>
-      </w:pPr>
-      <w:r>
-        <w:t>3.5 RSI Filter</w:t>
-      </w:r>
-    </w:p>
-    <w:p>
-      <w:r>
-        <w:t>• RSI period: 14</w:t>
-        <w:br/>
-        <w:t>• Range: 40-70 (disabled for manual scans via dashboard, enabled for CLI)</w:t>
-        <w:br/>
-        <w:t>• Prevents buying overbought stocks (RSI &gt; 70) or weak stocks (RSI &lt; 40)</w:t>
-      </w:r>
-    </w:p>
-    <w:p>
-      <w:pPr>
-        <w:pStyle w:val="Heading2"/>
-      </w:pPr>
-      <w:r>
-        <w:t>3.6 Relative Strength</w:t>
-      </w:r>
-    </w:p>
-    <w:p>
-      <w:r>
-        <w:t>• Compares stock performance to Nifty 50 over 63 trading days</w:t>
-        <w:br/>
-        <w:t>• Scored 0-100; higher is better</w:t>
-        <w:br/>
-        <w:t>• Used in priority ranking for final sorting</w:t>
-      </w:r>
-    </w:p>
-    <w:p>
-      <w:pPr>
-        <w:pStyle w:val="Heading2"/>
-      </w:pPr>
-      <w:r>
-        <w:t>3.7 Structure Confirmation</w:t>
-      </w:r>
-    </w:p>
-    <w:p>
-      <w:r>
-        <w:t>• Higher-High / Higher-Low (HH/HL): Confirms uptrend structure over 20 days</w:t>
+        <w:t>• Higher-High / Higher-Low (HH/HL): Confirms uptrend over 20 days</w:t>
         <w:br/>
         <w:t>• Low Wick: Identifies buying pressure (lower wick &lt; 30% of candle range)</w:t>
-        <w:br/>
-        <w:t>• Both add bonus points to the priority score</w:t>
       </w:r>
     </w:p>
     <w:p>
@@ -465,7 +460,7 @@
         <w:br/>
         <w:t>• RSI(14) on 1H HA Close</w:t>
         <w:br/>
-        <w:t>• ADX(14) and DMI(14) with Wilder smoothing</w:t>
+        <w:t>• ADX(14) and DMI(14) with Wilder smoothing (requires 33+ bars → 10 days of data)</w:t>
       </w:r>
     </w:p>
     <w:p>
@@ -478,7 +473,7 @@
     </w:p>
     <w:p>
       <w:r>
-        <w:t>Using the previous day's OHLC data, the following levels are computed:</w:t>
+        <w:t>Using the previous day's OHLC data:</w:t>
         <w:br/>
         <w:t>• Pivot = (High + Low + Close) / 3</w:t>
         <w:br/>
@@ -575,7 +570,7 @@
         <w:t xml:space="preserve">NEUTRAL: </w:t>
       </w:r>
       <w:r>
-        <w:t>No signal conditions met; may still note ADX/DMI state for reference</w:t>
+        <w:t>No signal conditions met; ADX/DMI state noted for reference</w:t>
       </w:r>
     </w:p>
     <w:p>
@@ -690,7 +685,7 @@
           </w:tcPr>
           <w:p>
             <w:r>
-              <w:t>Buy at signal price (or next open) with 5% SL, 10% Target</w:t>
+              <w:t>Buy at signal price with SL(5%)/Target(10%) for stocks</w:t>
             </w:r>
           </w:p>
         </w:tc>
@@ -732,7 +727,7 @@
           </w:tcPr>
           <w:p>
             <w:r>
-              <w:t>Buy at signal price (or next open) with 5% SL, 10% Target</w:t>
+              <w:t>Buy at signal price with SL(5%)/Target(10%) for stocks</w:t>
             </w:r>
           </w:p>
         </w:tc>
@@ -846,9 +841,11 @@
         <w:br/>
         <w:t>• Status is set to "Active" (no pending wait)</w:t>
         <w:br/>
+        <w:t>• Market hours check uses IST (UTC+5:30) via built-in timezone conversion</w:t>
+        <w:br/>
         <w:t>• Stop-loss (5%) and Target (10%) are calculated from entry price</w:t>
         <w:br/>
-        <w:t>• Quantity = ₹1,50,000 / entry price</w:t>
+        <w:t>• Quantity = ₹1,50,000 / entry price (rounded down)</w:t>
         <w:br/>
         <w:t>• Position enters monitoring immediately</w:t>
       </w:r>
@@ -863,7 +860,7 @@
     </w:p>
     <w:p>
       <w:r>
-        <w:t>When a BUY signal is detected in the end-of-day scan (after 3:30 PM):</w:t>
+        <w:t>When a BUY signal is detected after 3:30 PM IST:</w:t>
         <w:br/>
         <w:t>• Position is created as "Pending Entry"</w:t>
         <w:br/>
@@ -872,6 +869,8 @@
         <w:t>• SL, Target, and Quantity are calculated at that time</w:t>
         <w:br/>
         <w:t>• Position becomes "Active" and enters monitoring</w:t>
+        <w:br/>
+        <w:t>• Pending activation happens via the 15-min scheduler</w:t>
       </w:r>
     </w:p>
     <w:p>
@@ -879,16 +878,30 @@
         <w:pStyle w:val="Heading2"/>
       </w:pPr>
       <w:r>
-        <w:t>6.3 Position Parameters</w:t>
+        <w:t>6.3 Position Duplication Prevention</w:t>
       </w:r>
     </w:p>
-    <w:p/>
+    <w:p>
+      <w:r>
+        <w:t>Each symbol can only have ONE active or pending position at a time:</w:t>
+        <w:br/>
+        <w:t>• If a position already exists for a symbol (active or pending), new scans UPDATE it</w:t>
+        <w:br/>
+        <w:t>• Signal price, entry zone, and R:R are refreshed with latest data</w:t>
+        <w:br/>
+        <w:t>• Pending positions get activated if they're still pending and market is open</w:t>
+        <w:br/>
+        <w:t>• Old positions are NEVER replaced by new scans — only updated</w:t>
+        <w:br/>
+        <w:t>• This ensures positions persist until SL or Target is hit</w:t>
+      </w:r>
+    </w:p>
     <w:p>
       <w:pPr>
-        <w:pStyle w:val="ListBullet"/>
+        <w:pStyle w:val="Heading2"/>
       </w:pPr>
       <w:r>
-        <w:t>Capital per trade: ₹1,50,000</w:t>
+        <w:t>6.4 Position Parameters</w:t>
       </w:r>
     </w:p>
     <w:p>
@@ -896,7 +909,7 @@
         <w:pStyle w:val="ListBullet"/>
       </w:pPr>
       <w:r>
-        <w:t>Stop-Loss: 5% below entry price</w:t>
+        <w:t>Stocks: Capital ₹1.5L | SL 5% | Target 10% | Qty = Capital ÷ Price</w:t>
       </w:r>
     </w:p>
     <w:p>
@@ -904,23 +917,7 @@
         <w:pStyle w:val="ListBullet"/>
       </w:pPr>
       <w:r>
-        <w:t>Profit Target: 10% above entry price</w:t>
-      </w:r>
-    </w:p>
-    <w:p>
-      <w:pPr>
-        <w:pStyle w:val="ListBullet"/>
-      </w:pPr>
-      <w:r>
-        <w:t>Risk:Reward: 1:2</w:t>
-      </w:r>
-    </w:p>
-    <w:p>
-      <w:pPr>
-        <w:pStyle w:val="ListBullet"/>
-      </w:pPr>
-      <w:r>
-        <w:t>Position Sizing: Capital ÷ Entry Price = Quantity (rounded down)</w:t>
+        <w:t>Nifty 50: Qty 1 | SL 100 pts | Target 300 pts | Lot multiplier 65</w:t>
       </w:r>
     </w:p>
     <w:p>
@@ -932,8 +929,11 @@
       </w:r>
     </w:p>
     <w:p>
+      <w:pPr>
+        <w:pStyle w:val="ListBullet"/>
+      </w:pPr>
       <w:r>
-        <w:t>The risk management framework is designed for consistent, disciplined swing trading:</w:t>
+        <w:t>Capital Allocation: ₹1.5 Lakh per position for stocks. Nifty 50 uses 1 lot with ₹1.5L margin.</w:t>
       </w:r>
     </w:p>
     <w:p>
@@ -941,7 +941,7 @@
         <w:pStyle w:val="ListBullet"/>
       </w:pPr>
       <w:r>
-        <w:t>Capital Allocation: ₹1.5 Lakh per position, ensuring no single trade overwhelms the portfolio.</w:t>
+        <w:t>Stop-Loss: 5% fixed stop-loss for stocks. 100 points for Nifty 50. Auto-closed when price ≤ SL.</w:t>
       </w:r>
     </w:p>
     <w:p>
@@ -949,15 +949,7 @@
         <w:pStyle w:val="ListBullet"/>
       </w:pPr>
       <w:r>
-        <w:t>Stop-Loss: 5% fixed stop-loss. When current price &lt;= stop-loss level, position is automatically closed.</w:t>
-      </w:r>
-    </w:p>
-    <w:p>
-      <w:pPr>
-        <w:pStyle w:val="ListBullet"/>
-      </w:pPr>
-      <w:r>
-        <w:t>Profit Target: 10% fixed profit target. When current price &gt;= target, position is automatically closed.</w:t>
+        <w:t>Profit Target: 10% fixed for stocks. 300 points for Nifty 50. Auto-closed when price ≥ Target.</w:t>
       </w:r>
     </w:p>
     <w:p>
@@ -973,7 +965,7 @@
         <w:pStyle w:val="ListBullet"/>
       </w:pPr>
       <w:r>
-        <w:t>Manual Refresh: "Refresh Prices" button on dashboard forces immediate price update.</w:t>
+        <w:t>IST Timezone: All market hours checks convert UTC→IST (UTC+5:30) for correct operation on Render.</w:t>
       </w:r>
     </w:p>
     <w:p>
@@ -981,7 +973,7 @@
         <w:pStyle w:val="ListBullet"/>
       </w:pPr>
       <w:r>
-        <w:t>No Overnight Gap Risk: Entry happens at market open for EOD signals, so gap risk is minimized.</w:t>
+        <w:t>Manual Refresh: "Refresh Prices" button on dashboard forces immediate price update.</w:t>
       </w:r>
     </w:p>
     <w:p>
@@ -994,7 +986,7 @@
     </w:p>
     <w:p>
       <w:r>
-        <w:t>To ensure BUY signals are captured and acted upon the same day they occur, the scheduler runs 1H analysis at four intervals during market hours:</w:t>
+        <w:t>Four scheduled scans during market hours to catch intraday signals:</w:t>
       </w:r>
     </w:p>
     <w:tbl>
@@ -1182,14 +1174,15 @@
     <w:p>
       <w:r>
         <w:br/>
-        <w:t>In addition, a full EOD scan (370 stocks, daily + 1H) runs when:</w:t>
+        <w:t>In addition:</w:t>
         <w:br/>
-        <w:t>• You manually click "Run Scan" on the dashboard</w:t>
+        <w:t>• Full daily scan (370+1 stocks) runs when you click "Run Scan" on the dashboard</w:t>
         <w:br/>
-        <w:t>• The daily scheduled scan at 3:30 PM (if implemented)</w:t>
+        <w:t>• Trade position monitoring (SL/Target checks) runs every 15 minutes during market hours</w:t>
         <w:br/>
+        <w:t>• All scheduled jobs use CronTrigger with Asia/Kolkata timezone</w:t>
         <w:br/>
-        <w:t>Trade position monitoring (SL/Target checks) runs every 15 minutes during market hours.</w:t>
+        <w:t>• Dashboard auto-refreshes every 5 minutes to display latest data</w:t>
       </w:r>
     </w:p>
     <w:p>
@@ -1202,7 +1195,7 @@
     </w:p>
     <w:p>
       <w:r>
-        <w:t>The web dashboard provides real-time visibility into scan results and trade performance. It is built as a FastAPI backend with an HTML/CSS/JS frontend, deployable on Render.</w:t>
+        <w:t>The web dashboard provides real-time visibility into scan results and trade performance. It auto-refreshes every 5 minutes.</w:t>
       </w:r>
     </w:p>
     <w:p>
@@ -1218,7 +1211,7 @@
         <w:pStyle w:val="ListBullet"/>
       </w:pPr>
       <w:r>
-        <w:t>Watchlist Tab:</w:t>
+        <w:t>STOCKS Tab:</w:t>
       </w:r>
     </w:p>
     <w:p>
@@ -1234,7 +1227,7 @@
         <w:pStyle w:val="ListBullet2"/>
       </w:pPr>
       <w:r>
-        <w:t>Summary Card: Shows 📡 Scanned (universe size), 🎯 Qualified (passed filters), 🔍 Filtered Out, plus Fresh Breakout, BUY NOW, and WAIT counts</w:t>
+        <w:t>Summary Card: 📡 Scanned (universe size), 🎯 Qualified, 🔍 Filtered Out, Fresh Breakout, BUY NOW, WAIT</w:t>
       </w:r>
     </w:p>
     <w:p>
@@ -1242,7 +1235,15 @@
         <w:pStyle w:val="ListBullet2"/>
       </w:pPr>
       <w:r>
-        <w:t>Watchlist Table: Symbol, Sector, Price, Stage, 1H Setup, 1H Detail, D_E20 (distance from EMA20), R:R ratio</w:t>
+        <w:t>Watchlist Table: Symbol, Sector, Price, Stage, 1H Setup, 1H Detail, D_E20, R:R</w:t>
+      </w:r>
+    </w:p>
+    <w:p>
+      <w:pPr>
+        <w:pStyle w:val="ListBullet2"/>
+      </w:pPr>
+      <w:r>
+        <w:t>Nifty 50: Appears in the watchlist as a special instrument with its own signals</w:t>
       </w:r>
     </w:p>
     <w:p>
@@ -1298,6 +1299,14 @@
         <w:pStyle w:val="ListBullet2"/>
       </w:pPr>
       <w:r>
+        <w:t>Nifty 50 positions shown with qty=1, 65x lot multiplier applied to P&amp;L</w:t>
+      </w:r>
+    </w:p>
+    <w:p>
+      <w:pPr>
+        <w:pStyle w:val="ListBullet2"/>
+      </w:pPr>
+      <w:r>
         <w:t>Per-Symbol Performance: Signal count, wins, losses, win rate per stock</w:t>
       </w:r>
     </w:p>
@@ -1319,7 +1328,7 @@
     </w:p>
     <w:p>
       <w:r>
-        <w:t>The system maintains a complete trade history in trades_history.json with:</w:t>
+        <w:t>The system maintains complete trade history in a SQLite database (trades_history.db) with:</w:t>
       </w:r>
     </w:p>
     <w:p>
@@ -1327,7 +1336,7 @@
         <w:pStyle w:val="ListBullet"/>
       </w:pPr>
       <w:r>
-        <w:t>Portfolio-level aggregation: total invested, current value, net P&amp;L, return percentage, win rate</w:t>
+        <w:t>Portfolio-level aggregation: total invested, current value, net P&amp;L, return %, win rate</w:t>
       </w:r>
     </w:p>
     <w:p>
@@ -1359,7 +1368,345 @@
         <w:pStyle w:val="ListBullet"/>
       </w:pPr>
       <w:r>
-        <w:t>Data persists across server restarts via JSON file storage</w:t>
+        <w:t>Data persists across server restarts via Render persistent disk + SQLite</w:t>
+      </w:r>
+    </w:p>
+    <w:p>
+      <w:pPr>
+        <w:pStyle w:val="Heading1"/>
+      </w:pPr>
+      <w:r>
+        <w:t>11. Data Persistence — SQLite Database</w:t>
+      </w:r>
+    </w:p>
+    <w:p>
+      <w:r>
+        <w:t>Trade history is stored in a SQLite database (trades_history.db) instead of JSON files. This provides atomic writes, thread-safe concurrent access, and row-level operations.</w:t>
+      </w:r>
+    </w:p>
+    <w:p>
+      <w:pPr>
+        <w:pStyle w:val="ListBullet"/>
+      </w:pPr>
+      <w:r>
+        <w:t>Database: trades_history.db (SQLite, built into Python)</w:t>
+      </w:r>
+    </w:p>
+    <w:p>
+      <w:pPr>
+        <w:pStyle w:val="ListBullet"/>
+      </w:pPr>
+      <w:r>
+        <w:t>Storage: Render persistent disk at /data/ or local project directory as fallback</w:t>
+      </w:r>
+    </w:p>
+    <w:p>
+      <w:pPr>
+        <w:pStyle w:val="ListBullet"/>
+      </w:pPr>
+      <w:r>
+        <w:t>Reliability: Atomic WAL (Write-Ahead Logging) prevents corruption</w:t>
+      </w:r>
+    </w:p>
+    <w:p>
+      <w:pPr>
+        <w:pStyle w:val="ListBullet"/>
+      </w:pPr>
+      <w:r>
+        <w:t>Concurrency: Thread-safe with threading.Lock for all operations</w:t>
+      </w:r>
+    </w:p>
+    <w:p>
+      <w:pPr>
+        <w:pStyle w:val="ListBullet"/>
+      </w:pPr>
+      <w:r>
+        <w:t>Performance: Indexed on symbol and status columns for fast queries</w:t>
+      </w:r>
+    </w:p>
+    <w:p>
+      <w:pPr>
+        <w:pStyle w:val="ListBullet"/>
+      </w:pPr>
+      <w:r>
+        <w:t>No data loss: Survives all server restarts, redeploys, and crashes</w:t>
+      </w:r>
+    </w:p>
+    <w:p>
+      <w:pPr>
+        <w:pStyle w:val="ListBullet"/>
+      </w:pPr>
+      <w:r>
+        <w:t>Same public API: All get_tracker(), create_positions_from_results(), etc. unchanged</w:t>
+      </w:r>
+    </w:p>
+    <w:p>
+      <w:pPr>
+        <w:pStyle w:val="Heading1"/>
+      </w:pPr>
+      <w:r>
+        <w:t>12. Nifty 50 Index Trading</w:t>
+      </w:r>
+    </w:p>
+    <w:p>
+      <w:r>
+        <w:t>The Nifty 50 Spot Index (^NSEI) is scanned as a special instrument alongside the stock universe. It uses a modified trading rule set designed for index futures:</w:t>
+      </w:r>
+    </w:p>
+    <w:p>
+      <w:pPr>
+        <w:pStyle w:val="Heading2"/>
+      </w:pPr>
+      <w:r>
+        <w:t>12.1 Nifty 50 vs Stocks Comparison</w:t>
+      </w:r>
+    </w:p>
+    <w:tbl>
+      <w:tblPr>
+        <w:tblStyle w:val="LightGrid-Accent1"/>
+        <w:tblW w:type="auto" w:w="0"/>
+        <w:jc w:val="center"/>
+        <w:tblLook w:firstColumn="1" w:firstRow="1" w:lastColumn="0" w:lastRow="0" w:noHBand="0" w:noVBand="1" w:val="04A0"/>
+      </w:tblPr>
+      <w:tblGrid>
+        <w:gridCol w:w="4320"/>
+        <w:gridCol w:w="4320"/>
+      </w:tblGrid>
+      <w:tr>
+        <w:tc>
+          <w:tcPr>
+            <w:tcW w:type="dxa" w:w="4320"/>
+          </w:tcPr>
+          <w:p/>
+        </w:tc>
+        <w:tc>
+          <w:tcPr>
+            <w:tcW w:type="dxa" w:w="4320"/>
+          </w:tcPr>
+          <w:p/>
+        </w:tc>
+      </w:tr>
+      <w:tr>
+        <w:tc>
+          <w:tcPr>
+            <w:tcW w:type="dxa" w:w="4320"/>
+          </w:tcPr>
+          <w:p/>
+        </w:tc>
+        <w:tc>
+          <w:tcPr>
+            <w:tcW w:type="dxa" w:w="4320"/>
+          </w:tcPr>
+          <w:p/>
+        </w:tc>
+      </w:tr>
+      <w:tr>
+        <w:tc>
+          <w:tcPr>
+            <w:tcW w:type="dxa" w:w="4320"/>
+          </w:tcPr>
+          <w:p/>
+        </w:tc>
+        <w:tc>
+          <w:tcPr>
+            <w:tcW w:type="dxa" w:w="4320"/>
+          </w:tcPr>
+          <w:p/>
+        </w:tc>
+      </w:tr>
+      <w:tr>
+        <w:tc>
+          <w:tcPr>
+            <w:tcW w:type="dxa" w:w="4320"/>
+          </w:tcPr>
+          <w:p/>
+        </w:tc>
+        <w:tc>
+          <w:tcPr>
+            <w:tcW w:type="dxa" w:w="4320"/>
+          </w:tcPr>
+          <w:p/>
+        </w:tc>
+      </w:tr>
+      <w:tr>
+        <w:tc>
+          <w:tcPr>
+            <w:tcW w:type="dxa" w:w="4320"/>
+          </w:tcPr>
+          <w:p/>
+        </w:tc>
+        <w:tc>
+          <w:tcPr>
+            <w:tcW w:type="dxa" w:w="4320"/>
+          </w:tcPr>
+          <w:p/>
+        </w:tc>
+      </w:tr>
+      <w:tr>
+        <w:tc>
+          <w:tcPr>
+            <w:tcW w:type="dxa" w:w="4320"/>
+          </w:tcPr>
+          <w:p/>
+        </w:tc>
+        <w:tc>
+          <w:tcPr>
+            <w:tcW w:type="dxa" w:w="4320"/>
+          </w:tcPr>
+          <w:p/>
+        </w:tc>
+      </w:tr>
+      <w:tr>
+        <w:tc>
+          <w:tcPr>
+            <w:tcW w:type="dxa" w:w="4320"/>
+          </w:tcPr>
+          <w:p/>
+        </w:tc>
+        <w:tc>
+          <w:tcPr>
+            <w:tcW w:type="dxa" w:w="4320"/>
+          </w:tcPr>
+          <w:p/>
+        </w:tc>
+      </w:tr>
+    </w:tbl>
+    <w:p>
+      <w:pPr>
+        <w:pStyle w:val="ListBullet"/>
+      </w:pPr>
+      <w:r>
+        <w:t>Data Source: ^NSEI via yfinance — Nifty 50 Spot Index (proxy for futures)</w:t>
+      </w:r>
+    </w:p>
+    <w:p>
+      <w:pPr>
+        <w:pStyle w:val="ListBullet"/>
+      </w:pPr>
+      <w:r>
+        <w:t>Quantity: 1 position (fixed, not capital-based)</w:t>
+      </w:r>
+    </w:p>
+    <w:p>
+      <w:pPr>
+        <w:pStyle w:val="ListBullet"/>
+      </w:pPr>
+      <w:r>
+        <w:t>Lot Multiplier: 65 (1 position = 65 contracts on NSE)</w:t>
+      </w:r>
+    </w:p>
+    <w:p>
+      <w:pPr>
+        <w:pStyle w:val="ListBullet"/>
+      </w:pPr>
+      <w:r>
+        <w:t>Stop-Loss: 100 points below entry price (= -100 × 65 = -₹6,500)</w:t>
+      </w:r>
+    </w:p>
+    <w:p>
+      <w:pPr>
+        <w:pStyle w:val="ListBullet"/>
+      </w:pPr>
+      <w:r>
+        <w:t>Profit Target: 300 points above entry price (= +300 × 65 = +₹19,500)</w:t>
+      </w:r>
+    </w:p>
+    <w:p>
+      <w:pPr>
+        <w:pStyle w:val="ListBullet"/>
+      </w:pPr>
+      <w:r>
+        <w:t>Risk:Reward: 1:3 (100 pts risk → 300 pts reward)</w:t>
+      </w:r>
+    </w:p>
+    <w:p>
+      <w:pPr>
+        <w:pStyle w:val="ListBullet"/>
+      </w:pPr>
+      <w:r>
+        <w:t>P&amp;L: (Current Price - Entry Price) × 1 × 65 = ₹ per point</w:t>
+      </w:r>
+    </w:p>
+    <w:p>
+      <w:pPr>
+        <w:pStyle w:val="ListBullet"/>
+      </w:pPr>
+      <w:r>
+        <w:t>Same-day entry during market hours, next-day if after close</w:t>
+      </w:r>
+    </w:p>
+    <w:p>
+      <w:pPr>
+        <w:pStyle w:val="Heading2"/>
+      </w:pPr>
+      <w:r>
+        <w:t>12.2 Example Trade</w:t>
+      </w:r>
+    </w:p>
+    <w:p>
+      <w:r>
+        <w:t>Nifty gets BUY-B signal at 24,000:</w:t>
+        <w:br/>
+        <w:t>• Entry: 24,000</w:t>
+        <w:br/>
+        <w:t>• Stop-Loss: 23,900 (100 pts → -₹6,500 loss)</w:t>
+        <w:br/>
+        <w:t>• Target: 24,300 (300 pts → +₹19,500 profit)</w:t>
+        <w:br/>
+        <w:t>• Risk:Reward: 1:3</w:t>
+      </w:r>
+    </w:p>
+    <w:p>
+      <w:pPr>
+        <w:pStyle w:val="Heading1"/>
+      </w:pPr>
+      <w:r>
+        <w:t>13. Auto-Refresh &amp; Dashboard Sync</w:t>
+      </w:r>
+    </w:p>
+    <w:p>
+      <w:r>
+        <w:t>The dashboard automatically refreshes every 5 minutes to sync with the scheduler. This ensures new signals, position updates, and P&amp;L changes appear without manual page reload.</w:t>
+      </w:r>
+    </w:p>
+    <w:p>
+      <w:pPr>
+        <w:pStyle w:val="ListBullet"/>
+      </w:pPr>
+      <w:r>
+        <w:t>Watchlist auto-refresh: Every 5 minutes → reloads scan data from /api/watchlist/latest-data</w:t>
+      </w:r>
+    </w:p>
+    <w:p>
+      <w:pPr>
+        <w:pStyle w:val="ListBullet"/>
+      </w:pPr>
+      <w:r>
+        <w:t>Portfolio auto-refresh: Every 5 minutes → updates positions, P&amp;L, portfolio summary</w:t>
+      </w:r>
+    </w:p>
+    <w:p>
+      <w:pPr>
+        <w:pStyle w:val="ListBullet"/>
+      </w:pPr>
+      <w:r>
+        <w:t>Scan poll: Dashboard polls /api/scan/status every 3 seconds during an active manual scan</w:t>
+      </w:r>
+    </w:p>
+    <w:p>
+      <w:pPr>
+        <w:pStyle w:val="ListBullet"/>
+      </w:pPr>
+      <w:r>
+        <w:t>Max poll attempts: 300 (15 minutes timeout for long scans)</w:t>
+      </w:r>
+    </w:p>
+    <w:p>
+      <w:pPr>
+        <w:pStyle w:val="ListBullet"/>
+      </w:pPr>
+      <w:r>
+        <w:t>IST timezone: All server-side time checks convert UTC to IST for correct Indian market hours</w:t>
       </w:r>
     </w:p>
     <w:p>
@@ -1431,7 +1778,7 @@
           </w:tcPr>
           <w:p>
             <w:r>
-              <w:t>~370 Nifty500 stocks</w:t>
+              <w:t>~370 Nifty500 stocks + Nifty50 Index</w:t>
             </w:r>
           </w:p>
         </w:tc>
@@ -1475,7 +1822,7 @@
           </w:tcPr>
           <w:p>
             <w:r>
-              <w:t>10 days</w:t>
+              <w:t>10 days (33+ bars for ADX)</w:t>
             </w:r>
           </w:p>
         </w:tc>
@@ -1619,28 +1966,6 @@
           </w:tcPr>
           <w:p>
             <w:r>
-              <w:t>ADX Period</w:t>
-            </w:r>
-          </w:p>
-        </w:tc>
-        <w:tc>
-          <w:tcPr>
-            <w:tcW w:type="dxa" w:w="4320"/>
-          </w:tcPr>
-          <w:p>
-            <w:r>
-              <w:t>14</w:t>
-            </w:r>
-          </w:p>
-        </w:tc>
-      </w:tr>
-      <w:tr>
-        <w:tc>
-          <w:tcPr>
-            <w:tcW w:type="dxa" w:w="4320"/>
-          </w:tcPr>
-          <w:p>
-            <w:r>
               <w:t>ADX Threshold</w:t>
             </w:r>
           </w:p>
@@ -1685,7 +2010,7 @@
           </w:tcPr>
           <w:p>
             <w:r>
-              <w:t>Capital per Trade</w:t>
+              <w:t>Stock Capital</w:t>
             </w:r>
           </w:p>
         </w:tc>
@@ -1695,7 +2020,7 @@
           </w:tcPr>
           <w:p>
             <w:r>
-              <w:t>₹1,50,000</w:t>
+              <w:t>₹1,50,000 per trade</w:t>
             </w:r>
           </w:p>
         </w:tc>
@@ -1707,7 +2032,7 @@
           </w:tcPr>
           <w:p>
             <w:r>
-              <w:t>Stop-Loss %</w:t>
+              <w:t>Stock Stop-Loss</w:t>
             </w:r>
           </w:p>
         </w:tc>
@@ -1729,7 +2054,7 @@
           </w:tcPr>
           <w:p>
             <w:r>
-              <w:t>Profit Target %</w:t>
+              <w:t>Stock Target</w:t>
             </w:r>
           </w:p>
         </w:tc>
@@ -1751,7 +2076,7 @@
           </w:tcPr>
           <w:p>
             <w:r>
-              <w:t>Parallel Workers (1H)</w:t>
+              <w:t>Nifty Quantity</w:t>
             </w:r>
           </w:p>
         </w:tc>
@@ -1761,7 +2086,139 @@
           </w:tcPr>
           <w:p>
             <w:r>
-              <w:t>10</w:t>
+              <w:t>1 position (65 lot multiplier)</w:t>
+            </w:r>
+          </w:p>
+        </w:tc>
+      </w:tr>
+      <w:tr>
+        <w:tc>
+          <w:tcPr>
+            <w:tcW w:type="dxa" w:w="4320"/>
+          </w:tcPr>
+          <w:p>
+            <w:r>
+              <w:t>Nifty Stop-Loss</w:t>
+            </w:r>
+          </w:p>
+        </w:tc>
+        <w:tc>
+          <w:tcPr>
+            <w:tcW w:type="dxa" w:w="4320"/>
+          </w:tcPr>
+          <w:p>
+            <w:r>
+              <w:t>100 points below entry</w:t>
+            </w:r>
+          </w:p>
+        </w:tc>
+      </w:tr>
+      <w:tr>
+        <w:tc>
+          <w:tcPr>
+            <w:tcW w:type="dxa" w:w="4320"/>
+          </w:tcPr>
+          <w:p>
+            <w:r>
+              <w:t>Nifty Target</w:t>
+            </w:r>
+          </w:p>
+        </w:tc>
+        <w:tc>
+          <w:tcPr>
+            <w:tcW w:type="dxa" w:w="4320"/>
+          </w:tcPr>
+          <w:p>
+            <w:r>
+              <w:t>300 points above entry</w:t>
+            </w:r>
+          </w:p>
+        </w:tc>
+      </w:tr>
+      <w:tr>
+        <w:tc>
+          <w:tcPr>
+            <w:tcW w:type="dxa" w:w="4320"/>
+          </w:tcPr>
+          <w:p>
+            <w:r>
+              <w:t>Nifty P&amp;L per pt</w:t>
+            </w:r>
+          </w:p>
+        </w:tc>
+        <w:tc>
+          <w:tcPr>
+            <w:tcW w:type="dxa" w:w="4320"/>
+          </w:tcPr>
+          <w:p>
+            <w:r>
+              <w:t>₹65</w:t>
+            </w:r>
+          </w:p>
+        </w:tc>
+      </w:tr>
+      <w:tr>
+        <w:tc>
+          <w:tcPr>
+            <w:tcW w:type="dxa" w:w="4320"/>
+          </w:tcPr>
+          <w:p>
+            <w:r>
+              <w:t>Database</w:t>
+            </w:r>
+          </w:p>
+        </w:tc>
+        <w:tc>
+          <w:tcPr>
+            <w:tcW w:type="dxa" w:w="4320"/>
+          </w:tcPr>
+          <w:p>
+            <w:r>
+              <w:t>SQLite (trades_history.db)</w:t>
+            </w:r>
+          </w:p>
+        </w:tc>
+      </w:tr>
+      <w:tr>
+        <w:tc>
+          <w:tcPr>
+            <w:tcW w:type="dxa" w:w="4320"/>
+          </w:tcPr>
+          <w:p>
+            <w:r>
+              <w:t>Storage</w:t>
+            </w:r>
+          </w:p>
+        </w:tc>
+        <w:tc>
+          <w:tcPr>
+            <w:tcW w:type="dxa" w:w="4320"/>
+          </w:tcPr>
+          <w:p>
+            <w:r>
+              <w:t>Render /data disk or local fallback</w:t>
+            </w:r>
+          </w:p>
+        </w:tc>
+      </w:tr>
+      <w:tr>
+        <w:tc>
+          <w:tcPr>
+            <w:tcW w:type="dxa" w:w="4320"/>
+          </w:tcPr>
+          <w:p>
+            <w:r>
+              <w:t>Auto-Refresh</w:t>
+            </w:r>
+          </w:p>
+        </w:tc>
+        <w:tc>
+          <w:tcPr>
+            <w:tcW w:type="dxa" w:w="4320"/>
+          </w:tcPr>
+          <w:p>
+            <w:r>
+              <w:t>Every 5 minutes</w:t>
             </w:r>
           </w:p>
         </w:tc>
@@ -1784,6 +2241,50 @@
           <w:p>
             <w:r>
               <w:t>9:45, 11:00, 13:00, 14:30 IST</w:t>
+            </w:r>
+          </w:p>
+        </w:tc>
+      </w:tr>
+      <w:tr>
+        <w:tc>
+          <w:tcPr>
+            <w:tcW w:type="dxa" w:w="4320"/>
+          </w:tcPr>
+          <w:p>
+            <w:r>
+              <w:t>Timezone Handling</w:t>
+            </w:r>
+          </w:p>
+        </w:tc>
+        <w:tc>
+          <w:tcPr>
+            <w:tcW w:type="dxa" w:w="4320"/>
+          </w:tcPr>
+          <w:p>
+            <w:r>
+              <w:t>UTC→IST conversion on Render</w:t>
+            </w:r>
+          </w:p>
+        </w:tc>
+      </w:tr>
+      <w:tr>
+        <w:tc>
+          <w:tcPr>
+            <w:tcW w:type="dxa" w:w="4320"/>
+          </w:tcPr>
+          <w:p>
+            <w:r>
+              <w:t>Trade Monitoring</w:t>
+            </w:r>
+          </w:p>
+        </w:tc>
+        <w:tc>
+          <w:tcPr>
+            <w:tcW w:type="dxa" w:w="4320"/>
+          </w:tcPr>
+          <w:p>
+            <w:r>
+              <w:t>Every 15 minutes during market hours</w:t>
             </w:r>
           </w:p>
         </w:tc>

</xml_diff>